<commit_message>
Primer commit de rama de desarrollo
</commit_message>
<xml_diff>
--- a/Guia1/Recompilacion_guia.docx
+++ b/Guia1/Recompilacion_guia.docx
@@ -200,21 +200,7 @@
           <w:lang w:val="es-SV"/>
         </w:rPr>
         <w:lastRenderedPageBreak/>
-        <w:t xml:space="preserve">Y hacemos </w:t>
-      </w:r>
-      <w:proofErr w:type="spellStart"/>
-      <w:r>
-        <w:rPr>
-          <w:lang w:val="es-SV"/>
-        </w:rPr>
-        <w:t>pull</w:t>
-      </w:r>
-      <w:proofErr w:type="spellEnd"/>
-      <w:r>
-        <w:rPr>
-          <w:lang w:val="es-SV"/>
-        </w:rPr>
-        <w:t xml:space="preserve"> </w:t>
+        <w:t xml:space="preserve">Y hacemos pull </w:t>
       </w:r>
     </w:p>
     <w:p>
@@ -418,14 +404,12 @@
         </w:rPr>
         <w:t xml:space="preserve">Estructura de </w:t>
       </w:r>
-      <w:proofErr w:type="spellStart"/>
       <w:r>
         <w:rPr>
           <w:lang w:val="es-SV"/>
         </w:rPr>
         <w:t>reposiorio</w:t>
       </w:r>
-      <w:proofErr w:type="spellEnd"/>
     </w:p>
     <w:p>
       <w:pPr>
@@ -491,21 +475,7 @@
         <w:rPr>
           <w:lang w:val="es-SV"/>
         </w:rPr>
-        <w:t xml:space="preserve">Intentar hacer </w:t>
-      </w:r>
-      <w:proofErr w:type="spellStart"/>
-      <w:r>
-        <w:rPr>
-          <w:lang w:val="es-SV"/>
-        </w:rPr>
-        <w:t>commit</w:t>
-      </w:r>
-      <w:proofErr w:type="spellEnd"/>
-      <w:r>
-        <w:rPr>
-          <w:lang w:val="es-SV"/>
-        </w:rPr>
-        <w:t xml:space="preserve"> </w:t>
+        <w:t xml:space="preserve">Intentar hacer commit </w:t>
       </w:r>
     </w:p>
     <w:p>
@@ -651,35 +621,7 @@
         <w:rPr>
           <w:lang w:val="es-SV"/>
         </w:rPr>
-        <w:t xml:space="preserve">luego de hacer un </w:t>
-      </w:r>
-      <w:proofErr w:type="spellStart"/>
-      <w:r>
-        <w:rPr>
-          <w:lang w:val="es-SV"/>
-        </w:rPr>
-        <w:t>git</w:t>
-      </w:r>
-      <w:proofErr w:type="spellEnd"/>
-      <w:r>
-        <w:rPr>
-          <w:lang w:val="es-SV"/>
-        </w:rPr>
-        <w:t xml:space="preserve"> </w:t>
-      </w:r>
-      <w:proofErr w:type="spellStart"/>
-      <w:r>
-        <w:rPr>
-          <w:lang w:val="es-SV"/>
-        </w:rPr>
-        <w:t>pull</w:t>
-      </w:r>
-      <w:proofErr w:type="spellEnd"/>
-      <w:r>
-        <w:rPr>
-          <w:lang w:val="es-SV"/>
-        </w:rPr>
-        <w:t xml:space="preserve"> </w:t>
+        <w:t xml:space="preserve">luego de hacer un git pull </w:t>
       </w:r>
     </w:p>
     <w:p>
@@ -800,6 +742,60 @@
           <w:lang w:val="es-SV"/>
         </w:rPr>
         <w:t xml:space="preserve">4.aceptamos </w:t>
+      </w:r>
+      <w:r>
+        <w:rPr>
+          <w:lang w:val="es-SV"/>
+        </w:rPr>
+        <w:t xml:space="preserve">los cambios  y hacemos commit </w:t>
+      </w:r>
+    </w:p>
+    <w:p>
+      <w:pPr>
+        <w:rPr>
+          <w:lang w:val="es-SV"/>
+        </w:rPr>
+      </w:pPr>
+      <w:r>
+        <w:rPr>
+          <w:noProof/>
+        </w:rPr>
+        <w:lastRenderedPageBreak/>
+        <w:drawing>
+          <wp:inline distT="0" distB="0" distL="0" distR="0" wp14:anchorId="724B7145" wp14:editId="549A73D8">
+            <wp:extent cx="5612130" cy="2058670"/>
+            <wp:effectExtent l="0" t="0" r="7620" b="0"/>
+            <wp:docPr id="123934618" name="Imagen 1"/>
+            <wp:cNvGraphicFramePr>
+              <a:graphicFrameLocks xmlns:a="http://schemas.openxmlformats.org/drawingml/2006/main" noChangeAspect="1"/>
+            </wp:cNvGraphicFramePr>
+            <a:graphic xmlns:a="http://schemas.openxmlformats.org/drawingml/2006/main">
+              <a:graphicData uri="http://schemas.openxmlformats.org/drawingml/2006/picture">
+                <pic:pic xmlns:pic="http://schemas.openxmlformats.org/drawingml/2006/picture">
+                  <pic:nvPicPr>
+                    <pic:cNvPr id="123934618" name=""/>
+                    <pic:cNvPicPr/>
+                  </pic:nvPicPr>
+                  <pic:blipFill>
+                    <a:blip r:embed="rId15"/>
+                    <a:stretch>
+                      <a:fillRect/>
+                    </a:stretch>
+                  </pic:blipFill>
+                  <pic:spPr>
+                    <a:xfrm>
+                      <a:off x="0" y="0"/>
+                      <a:ext cx="5612130" cy="2058670"/>
+                    </a:xfrm>
+                    <a:prstGeom prst="rect">
+                      <a:avLst/>
+                    </a:prstGeom>
+                  </pic:spPr>
+                </pic:pic>
+              </a:graphicData>
+            </a:graphic>
+          </wp:inline>
+        </w:drawing>
       </w:r>
     </w:p>
     <w:p>

</xml_diff>

<commit_message>
Primer commit de Pruebas
</commit_message>
<xml_diff>
--- a/Guia1/Recompilacion_guia.docx
+++ b/Guia1/Recompilacion_guia.docx
@@ -200,21 +200,7 @@
           <w:lang w:val="es-SV"/>
         </w:rPr>
         <w:lastRenderedPageBreak/>
-        <w:t xml:space="preserve">Y hacemos </w:t>
-      </w:r>
-      <w:proofErr w:type="spellStart"/>
-      <w:r>
-        <w:rPr>
-          <w:lang w:val="es-SV"/>
-        </w:rPr>
-        <w:t>pull</w:t>
-      </w:r>
-      <w:proofErr w:type="spellEnd"/>
-      <w:r>
-        <w:rPr>
-          <w:lang w:val="es-SV"/>
-        </w:rPr>
-        <w:t xml:space="preserve"> </w:t>
+        <w:t xml:space="preserve">Y hacemos pull </w:t>
       </w:r>
     </w:p>
     <w:p>
@@ -418,14 +404,12 @@
         </w:rPr>
         <w:t xml:space="preserve">Estructura de </w:t>
       </w:r>
-      <w:proofErr w:type="spellStart"/>
       <w:r>
         <w:rPr>
           <w:lang w:val="es-SV"/>
         </w:rPr>
         <w:t>reposiorio</w:t>
       </w:r>
-      <w:proofErr w:type="spellEnd"/>
     </w:p>
     <w:p>
       <w:pPr>
@@ -491,21 +475,7 @@
         <w:rPr>
           <w:lang w:val="es-SV"/>
         </w:rPr>
-        <w:t xml:space="preserve">Intentar hacer </w:t>
-      </w:r>
-      <w:proofErr w:type="spellStart"/>
-      <w:r>
-        <w:rPr>
-          <w:lang w:val="es-SV"/>
-        </w:rPr>
-        <w:t>commit</w:t>
-      </w:r>
-      <w:proofErr w:type="spellEnd"/>
-      <w:r>
-        <w:rPr>
-          <w:lang w:val="es-SV"/>
-        </w:rPr>
-        <w:t xml:space="preserve"> </w:t>
+        <w:t xml:space="preserve">Intentar hacer commit </w:t>
       </w:r>
     </w:p>
     <w:p>
@@ -651,35 +621,7 @@
         <w:rPr>
           <w:lang w:val="es-SV"/>
         </w:rPr>
-        <w:t xml:space="preserve">luego de hacer un </w:t>
-      </w:r>
-      <w:proofErr w:type="spellStart"/>
-      <w:r>
-        <w:rPr>
-          <w:lang w:val="es-SV"/>
-        </w:rPr>
-        <w:t>git</w:t>
-      </w:r>
-      <w:proofErr w:type="spellEnd"/>
-      <w:r>
-        <w:rPr>
-          <w:lang w:val="es-SV"/>
-        </w:rPr>
-        <w:t xml:space="preserve"> </w:t>
-      </w:r>
-      <w:proofErr w:type="spellStart"/>
-      <w:r>
-        <w:rPr>
-          <w:lang w:val="es-SV"/>
-        </w:rPr>
-        <w:t>pull</w:t>
-      </w:r>
-      <w:proofErr w:type="spellEnd"/>
-      <w:r>
-        <w:rPr>
-          <w:lang w:val="es-SV"/>
-        </w:rPr>
-        <w:t xml:space="preserve"> </w:t>
+        <w:t xml:space="preserve">luego de hacer un git pull </w:t>
       </w:r>
     </w:p>
     <w:p>
@@ -800,6 +742,60 @@
           <w:lang w:val="es-SV"/>
         </w:rPr>
         <w:t xml:space="preserve">4.aceptamos </w:t>
+      </w:r>
+      <w:r>
+        <w:rPr>
+          <w:lang w:val="es-SV"/>
+        </w:rPr>
+        <w:t xml:space="preserve">los cambios  y hacemos commit </w:t>
+      </w:r>
+    </w:p>
+    <w:p>
+      <w:pPr>
+        <w:rPr>
+          <w:lang w:val="es-SV"/>
+        </w:rPr>
+      </w:pPr>
+      <w:r>
+        <w:rPr>
+          <w:noProof/>
+        </w:rPr>
+        <w:lastRenderedPageBreak/>
+        <w:drawing>
+          <wp:inline distT="0" distB="0" distL="0" distR="0" wp14:anchorId="724B7145" wp14:editId="549A73D8">
+            <wp:extent cx="5612130" cy="2058670"/>
+            <wp:effectExtent l="0" t="0" r="7620" b="0"/>
+            <wp:docPr id="123934618" name="Imagen 1"/>
+            <wp:cNvGraphicFramePr>
+              <a:graphicFrameLocks xmlns:a="http://schemas.openxmlformats.org/drawingml/2006/main" noChangeAspect="1"/>
+            </wp:cNvGraphicFramePr>
+            <a:graphic xmlns:a="http://schemas.openxmlformats.org/drawingml/2006/main">
+              <a:graphicData uri="http://schemas.openxmlformats.org/drawingml/2006/picture">
+                <pic:pic xmlns:pic="http://schemas.openxmlformats.org/drawingml/2006/picture">
+                  <pic:nvPicPr>
+                    <pic:cNvPr id="123934618" name=""/>
+                    <pic:cNvPicPr/>
+                  </pic:nvPicPr>
+                  <pic:blipFill>
+                    <a:blip r:embed="rId15"/>
+                    <a:stretch>
+                      <a:fillRect/>
+                    </a:stretch>
+                  </pic:blipFill>
+                  <pic:spPr>
+                    <a:xfrm>
+                      <a:off x="0" y="0"/>
+                      <a:ext cx="5612130" cy="2058670"/>
+                    </a:xfrm>
+                    <a:prstGeom prst="rect">
+                      <a:avLst/>
+                    </a:prstGeom>
+                  </pic:spPr>
+                </pic:pic>
+              </a:graphicData>
+            </a:graphic>
+          </wp:inline>
+        </w:drawing>
       </w:r>
     </w:p>
     <w:p>

</xml_diff>

<commit_message>
Primer commit de la rama Produccion
</commit_message>
<xml_diff>
--- a/Guia1/Recompilacion_guia.docx
+++ b/Guia1/Recompilacion_guia.docx
@@ -200,21 +200,7 @@
           <w:lang w:val="es-SV"/>
         </w:rPr>
         <w:lastRenderedPageBreak/>
-        <w:t xml:space="preserve">Y hacemos </w:t>
-      </w:r>
-      <w:proofErr w:type="spellStart"/>
-      <w:r>
-        <w:rPr>
-          <w:lang w:val="es-SV"/>
-        </w:rPr>
-        <w:t>pull</w:t>
-      </w:r>
-      <w:proofErr w:type="spellEnd"/>
-      <w:r>
-        <w:rPr>
-          <w:lang w:val="es-SV"/>
-        </w:rPr>
-        <w:t xml:space="preserve"> </w:t>
+        <w:t xml:space="preserve">Y hacemos pull </w:t>
       </w:r>
     </w:p>
     <w:p>
@@ -418,14 +404,12 @@
         </w:rPr>
         <w:t xml:space="preserve">Estructura de </w:t>
       </w:r>
-      <w:proofErr w:type="spellStart"/>
       <w:r>
         <w:rPr>
           <w:lang w:val="es-SV"/>
         </w:rPr>
         <w:t>reposiorio</w:t>
       </w:r>
-      <w:proofErr w:type="spellEnd"/>
     </w:p>
     <w:p>
       <w:pPr>
@@ -491,21 +475,7 @@
         <w:rPr>
           <w:lang w:val="es-SV"/>
         </w:rPr>
-        <w:t xml:space="preserve">Intentar hacer </w:t>
-      </w:r>
-      <w:proofErr w:type="spellStart"/>
-      <w:r>
-        <w:rPr>
-          <w:lang w:val="es-SV"/>
-        </w:rPr>
-        <w:t>commit</w:t>
-      </w:r>
-      <w:proofErr w:type="spellEnd"/>
-      <w:r>
-        <w:rPr>
-          <w:lang w:val="es-SV"/>
-        </w:rPr>
-        <w:t xml:space="preserve"> </w:t>
+        <w:t xml:space="preserve">Intentar hacer commit </w:t>
       </w:r>
     </w:p>
     <w:p>
@@ -651,35 +621,7 @@
         <w:rPr>
           <w:lang w:val="es-SV"/>
         </w:rPr>
-        <w:t xml:space="preserve">luego de hacer un </w:t>
-      </w:r>
-      <w:proofErr w:type="spellStart"/>
-      <w:r>
-        <w:rPr>
-          <w:lang w:val="es-SV"/>
-        </w:rPr>
-        <w:t>git</w:t>
-      </w:r>
-      <w:proofErr w:type="spellEnd"/>
-      <w:r>
-        <w:rPr>
-          <w:lang w:val="es-SV"/>
-        </w:rPr>
-        <w:t xml:space="preserve"> </w:t>
-      </w:r>
-      <w:proofErr w:type="spellStart"/>
-      <w:r>
-        <w:rPr>
-          <w:lang w:val="es-SV"/>
-        </w:rPr>
-        <w:t>pull</w:t>
-      </w:r>
-      <w:proofErr w:type="spellEnd"/>
-      <w:r>
-        <w:rPr>
-          <w:lang w:val="es-SV"/>
-        </w:rPr>
-        <w:t xml:space="preserve"> </w:t>
+        <w:t xml:space="preserve">luego de hacer un git pull </w:t>
       </w:r>
     </w:p>
     <w:p>
@@ -800,6 +742,60 @@
           <w:lang w:val="es-SV"/>
         </w:rPr>
         <w:t xml:space="preserve">4.aceptamos </w:t>
+      </w:r>
+      <w:r>
+        <w:rPr>
+          <w:lang w:val="es-SV"/>
+        </w:rPr>
+        <w:t xml:space="preserve">los cambios  y hacemos commit </w:t>
+      </w:r>
+    </w:p>
+    <w:p>
+      <w:pPr>
+        <w:rPr>
+          <w:lang w:val="es-SV"/>
+        </w:rPr>
+      </w:pPr>
+      <w:r>
+        <w:rPr>
+          <w:noProof/>
+        </w:rPr>
+        <w:lastRenderedPageBreak/>
+        <w:drawing>
+          <wp:inline distT="0" distB="0" distL="0" distR="0" wp14:anchorId="724B7145" wp14:editId="549A73D8">
+            <wp:extent cx="5612130" cy="2058670"/>
+            <wp:effectExtent l="0" t="0" r="7620" b="0"/>
+            <wp:docPr id="123934618" name="Imagen 1"/>
+            <wp:cNvGraphicFramePr>
+              <a:graphicFrameLocks xmlns:a="http://schemas.openxmlformats.org/drawingml/2006/main" noChangeAspect="1"/>
+            </wp:cNvGraphicFramePr>
+            <a:graphic xmlns:a="http://schemas.openxmlformats.org/drawingml/2006/main">
+              <a:graphicData uri="http://schemas.openxmlformats.org/drawingml/2006/picture">
+                <pic:pic xmlns:pic="http://schemas.openxmlformats.org/drawingml/2006/picture">
+                  <pic:nvPicPr>
+                    <pic:cNvPr id="123934618" name=""/>
+                    <pic:cNvPicPr/>
+                  </pic:nvPicPr>
+                  <pic:blipFill>
+                    <a:blip r:embed="rId15"/>
+                    <a:stretch>
+                      <a:fillRect/>
+                    </a:stretch>
+                  </pic:blipFill>
+                  <pic:spPr>
+                    <a:xfrm>
+                      <a:off x="0" y="0"/>
+                      <a:ext cx="5612130" cy="2058670"/>
+                    </a:xfrm>
+                    <a:prstGeom prst="rect">
+                      <a:avLst/>
+                    </a:prstGeom>
+                  </pic:spPr>
+                </pic:pic>
+              </a:graphicData>
+            </a:graphic>
+          </wp:inline>
+        </w:drawing>
       </w:r>
     </w:p>
     <w:p>

</xml_diff>

<commit_message>
Merge de Desarrollo a Pruebas
</commit_message>
<xml_diff>
--- a/Guia1/Recompilacion_guia.docx
+++ b/Guia1/Recompilacion_guia.docx
@@ -34,11 +34,19 @@
           <w:lang w:val="es-SV"/>
         </w:rPr>
       </w:pPr>
-      <w:r>
-        <w:rPr>
-          <w:lang w:val="es-SV"/>
-        </w:rPr>
-        <w:t xml:space="preserve">GIT : </w:t>
+      <w:proofErr w:type="gramStart"/>
+      <w:r>
+        <w:rPr>
+          <w:lang w:val="es-SV"/>
+        </w:rPr>
+        <w:t>GIT :</w:t>
+      </w:r>
+      <w:proofErr w:type="gramEnd"/>
+      <w:r>
+        <w:rPr>
+          <w:lang w:val="es-SV"/>
+        </w:rPr>
+        <w:t xml:space="preserve"> </w:t>
       </w:r>
       <w:hyperlink r:id="rId4" w:history="1">
         <w:r>
@@ -200,7 +208,21 @@
           <w:lang w:val="es-SV"/>
         </w:rPr>
         <w:lastRenderedPageBreak/>
-        <w:t xml:space="preserve">Y hacemos pull </w:t>
+        <w:t xml:space="preserve">Y hacemos </w:t>
+      </w:r>
+      <w:proofErr w:type="spellStart"/>
+      <w:r>
+        <w:rPr>
+          <w:lang w:val="es-SV"/>
+        </w:rPr>
+        <w:t>pull</w:t>
+      </w:r>
+      <w:proofErr w:type="spellEnd"/>
+      <w:r>
+        <w:rPr>
+          <w:lang w:val="es-SV"/>
+        </w:rPr>
+        <w:t xml:space="preserve"> </w:t>
       </w:r>
     </w:p>
     <w:p>
@@ -404,12 +426,14 @@
         </w:rPr>
         <w:t xml:space="preserve">Estructura de </w:t>
       </w:r>
+      <w:proofErr w:type="spellStart"/>
       <w:r>
         <w:rPr>
           <w:lang w:val="es-SV"/>
         </w:rPr>
         <w:t>reposiorio</w:t>
       </w:r>
+      <w:proofErr w:type="spellEnd"/>
     </w:p>
     <w:p>
       <w:pPr>
@@ -475,7 +499,21 @@
         <w:rPr>
           <w:lang w:val="es-SV"/>
         </w:rPr>
-        <w:t xml:space="preserve">Intentar hacer commit </w:t>
+        <w:t xml:space="preserve">Intentar hacer </w:t>
+      </w:r>
+      <w:proofErr w:type="spellStart"/>
+      <w:r>
+        <w:rPr>
+          <w:lang w:val="es-SV"/>
+        </w:rPr>
+        <w:t>commit</w:t>
+      </w:r>
+      <w:proofErr w:type="spellEnd"/>
+      <w:r>
+        <w:rPr>
+          <w:lang w:val="es-SV"/>
+        </w:rPr>
+        <w:t xml:space="preserve"> </w:t>
       </w:r>
     </w:p>
     <w:p>
@@ -554,7 +592,21 @@
         <w:rPr>
           <w:lang w:val="es-SV"/>
         </w:rPr>
-        <w:t>1.validamos el status del repositorio</w:t>
+        <w:t xml:space="preserve">1.validamos el </w:t>
+      </w:r>
+      <w:proofErr w:type="gramStart"/>
+      <w:r>
+        <w:rPr>
+          <w:lang w:val="es-SV"/>
+        </w:rPr>
+        <w:t>status</w:t>
+      </w:r>
+      <w:proofErr w:type="gramEnd"/>
+      <w:r>
+        <w:rPr>
+          <w:lang w:val="es-SV"/>
+        </w:rPr>
+        <w:t xml:space="preserve"> del repositorio</w:t>
       </w:r>
     </w:p>
     <w:p>
@@ -621,7 +673,35 @@
         <w:rPr>
           <w:lang w:val="es-SV"/>
         </w:rPr>
-        <w:t xml:space="preserve">luego de hacer un git pull </w:t>
+        <w:t xml:space="preserve">luego de hacer un </w:t>
+      </w:r>
+      <w:proofErr w:type="spellStart"/>
+      <w:r>
+        <w:rPr>
+          <w:lang w:val="es-SV"/>
+        </w:rPr>
+        <w:t>git</w:t>
+      </w:r>
+      <w:proofErr w:type="spellEnd"/>
+      <w:r>
+        <w:rPr>
+          <w:lang w:val="es-SV"/>
+        </w:rPr>
+        <w:t xml:space="preserve"> </w:t>
+      </w:r>
+      <w:proofErr w:type="spellStart"/>
+      <w:r>
+        <w:rPr>
+          <w:lang w:val="es-SV"/>
+        </w:rPr>
+        <w:t>pull</w:t>
+      </w:r>
+      <w:proofErr w:type="spellEnd"/>
+      <w:r>
+        <w:rPr>
+          <w:lang w:val="es-SV"/>
+        </w:rPr>
+        <w:t xml:space="preserve"> </w:t>
       </w:r>
     </w:p>
     <w:p>
@@ -747,7 +827,35 @@
         <w:rPr>
           <w:lang w:val="es-SV"/>
         </w:rPr>
-        <w:t xml:space="preserve">los cambios  y hacemos commit </w:t>
+        <w:t xml:space="preserve">los </w:t>
+      </w:r>
+      <w:proofErr w:type="gramStart"/>
+      <w:r>
+        <w:rPr>
+          <w:lang w:val="es-SV"/>
+        </w:rPr>
+        <w:t>cambios  y</w:t>
+      </w:r>
+      <w:proofErr w:type="gramEnd"/>
+      <w:r>
+        <w:rPr>
+          <w:lang w:val="es-SV"/>
+        </w:rPr>
+        <w:t xml:space="preserve"> hacemos </w:t>
+      </w:r>
+      <w:proofErr w:type="spellStart"/>
+      <w:r>
+        <w:rPr>
+          <w:lang w:val="es-SV"/>
+        </w:rPr>
+        <w:t>commit</w:t>
+      </w:r>
+      <w:proofErr w:type="spellEnd"/>
+      <w:r>
+        <w:rPr>
+          <w:lang w:val="es-SV"/>
+        </w:rPr>
+        <w:t xml:space="preserve"> </w:t>
       </w:r>
     </w:p>
     <w:p>
@@ -786,6 +894,237 @@
                     <a:xfrm>
                       <a:off x="0" y="0"/>
                       <a:ext cx="5612130" cy="2058670"/>
+                    </a:xfrm>
+                    <a:prstGeom prst="rect">
+                      <a:avLst/>
+                    </a:prstGeom>
+                  </pic:spPr>
+                </pic:pic>
+              </a:graphicData>
+            </a:graphic>
+          </wp:inline>
+        </w:drawing>
+      </w:r>
+    </w:p>
+    <w:p>
+      <w:pPr>
+        <w:rPr>
+          <w:lang w:val="es-SV"/>
+        </w:rPr>
+      </w:pPr>
+      <w:proofErr w:type="spellStart"/>
+      <w:r>
+        <w:rPr>
+          <w:lang w:val="es-SV"/>
+        </w:rPr>
+        <w:t>Creacion</w:t>
+      </w:r>
+      <w:proofErr w:type="spellEnd"/>
+      <w:r>
+        <w:rPr>
+          <w:lang w:val="es-SV"/>
+        </w:rPr>
+        <w:t xml:space="preserve"> </w:t>
+      </w:r>
+      <w:proofErr w:type="gramStart"/>
+      <w:r>
+        <w:rPr>
+          <w:lang w:val="es-SV"/>
+        </w:rPr>
+        <w:t>de  Ramas</w:t>
+      </w:r>
+      <w:proofErr w:type="gramEnd"/>
+      <w:r>
+        <w:rPr>
+          <w:lang w:val="es-SV"/>
+        </w:rPr>
+        <w:t xml:space="preserve"> de producción Pruebas y desarrollo </w:t>
+      </w:r>
+    </w:p>
+    <w:p>
+      <w:pPr>
+        <w:rPr>
+          <w:lang w:val="es-SV"/>
+        </w:rPr>
+      </w:pPr>
+      <w:r>
+        <w:rPr>
+          <w:noProof/>
+        </w:rPr>
+        <w:drawing>
+          <wp:inline distT="0" distB="0" distL="0" distR="0" wp14:anchorId="693AD82D" wp14:editId="11841968">
+            <wp:extent cx="3962400" cy="3886200"/>
+            <wp:effectExtent l="0" t="0" r="0" b="0"/>
+            <wp:docPr id="1974759918" name="Imagen 1"/>
+            <wp:cNvGraphicFramePr>
+              <a:graphicFrameLocks xmlns:a="http://schemas.openxmlformats.org/drawingml/2006/main" noChangeAspect="1"/>
+            </wp:cNvGraphicFramePr>
+            <a:graphic xmlns:a="http://schemas.openxmlformats.org/drawingml/2006/main">
+              <a:graphicData uri="http://schemas.openxmlformats.org/drawingml/2006/picture">
+                <pic:pic xmlns:pic="http://schemas.openxmlformats.org/drawingml/2006/picture">
+                  <pic:nvPicPr>
+                    <pic:cNvPr id="1974759918" name=""/>
+                    <pic:cNvPicPr/>
+                  </pic:nvPicPr>
+                  <pic:blipFill>
+                    <a:blip r:embed="rId16"/>
+                    <a:stretch>
+                      <a:fillRect/>
+                    </a:stretch>
+                  </pic:blipFill>
+                  <pic:spPr>
+                    <a:xfrm>
+                      <a:off x="0" y="0"/>
+                      <a:ext cx="3962400" cy="3886200"/>
+                    </a:xfrm>
+                    <a:prstGeom prst="rect">
+                      <a:avLst/>
+                    </a:prstGeom>
+                  </pic:spPr>
+                </pic:pic>
+              </a:graphicData>
+            </a:graphic>
+          </wp:inline>
+        </w:drawing>
+      </w:r>
+    </w:p>
+    <w:p>
+      <w:pPr>
+        <w:rPr>
+          <w:lang w:val="es-SV"/>
+        </w:rPr>
+      </w:pPr>
+      <w:r>
+        <w:rPr>
+          <w:lang w:val="es-SV"/>
+        </w:rPr>
+        <w:t xml:space="preserve">Git </w:t>
+      </w:r>
+      <w:proofErr w:type="spellStart"/>
+      <w:r>
+        <w:rPr>
+          <w:lang w:val="es-SV"/>
+        </w:rPr>
+        <w:t>merge</w:t>
+      </w:r>
+      <w:proofErr w:type="spellEnd"/>
+      <w:r>
+        <w:rPr>
+          <w:lang w:val="es-SV"/>
+        </w:rPr>
+        <w:t xml:space="preserve"> de </w:t>
+      </w:r>
+      <w:r>
+        <w:rPr>
+          <w:lang w:val="es-SV"/>
+        </w:rPr>
+        <w:t>Desarrollo a Pruebas</w:t>
+      </w:r>
+    </w:p>
+    <w:p>
+      <w:pPr>
+        <w:rPr>
+          <w:lang w:val="es-SV"/>
+        </w:rPr>
+      </w:pPr>
+      <w:r>
+        <w:rPr>
+          <w:noProof/>
+        </w:rPr>
+        <w:lastRenderedPageBreak/>
+        <w:drawing>
+          <wp:inline distT="0" distB="0" distL="0" distR="0" wp14:anchorId="2EB5B5EA" wp14:editId="6FEE61FC">
+            <wp:extent cx="5612130" cy="2355215"/>
+            <wp:effectExtent l="0" t="0" r="7620" b="6985"/>
+            <wp:docPr id="385662698" name="Imagen 1"/>
+            <wp:cNvGraphicFramePr>
+              <a:graphicFrameLocks xmlns:a="http://schemas.openxmlformats.org/drawingml/2006/main" noChangeAspect="1"/>
+            </wp:cNvGraphicFramePr>
+            <a:graphic xmlns:a="http://schemas.openxmlformats.org/drawingml/2006/main">
+              <a:graphicData uri="http://schemas.openxmlformats.org/drawingml/2006/picture">
+                <pic:pic xmlns:pic="http://schemas.openxmlformats.org/drawingml/2006/picture">
+                  <pic:nvPicPr>
+                    <pic:cNvPr id="385662698" name=""/>
+                    <pic:cNvPicPr/>
+                  </pic:nvPicPr>
+                  <pic:blipFill>
+                    <a:blip r:embed="rId17"/>
+                    <a:stretch>
+                      <a:fillRect/>
+                    </a:stretch>
+                  </pic:blipFill>
+                  <pic:spPr>
+                    <a:xfrm>
+                      <a:off x="0" y="0"/>
+                      <a:ext cx="5612130" cy="2355215"/>
+                    </a:xfrm>
+                    <a:prstGeom prst="rect">
+                      <a:avLst/>
+                    </a:prstGeom>
+                  </pic:spPr>
+                </pic:pic>
+              </a:graphicData>
+            </a:graphic>
+          </wp:inline>
+        </w:drawing>
+      </w:r>
+    </w:p>
+    <w:p>
+      <w:pPr>
+        <w:rPr>
+          <w:lang w:val="es-SV"/>
+        </w:rPr>
+      </w:pPr>
+      <w:r>
+        <w:rPr>
+          <w:lang w:val="es-SV"/>
+        </w:rPr>
+        <w:t xml:space="preserve">Resultado de </w:t>
+      </w:r>
+      <w:proofErr w:type="spellStart"/>
+      <w:r>
+        <w:rPr>
+          <w:lang w:val="es-SV"/>
+        </w:rPr>
+        <w:t>Merge</w:t>
+      </w:r>
+      <w:proofErr w:type="spellEnd"/>
+    </w:p>
+    <w:p>
+      <w:pPr>
+        <w:rPr>
+          <w:lang w:val="es-SV"/>
+        </w:rPr>
+      </w:pPr>
+      <w:r>
+        <w:rPr>
+          <w:noProof/>
+        </w:rPr>
+        <w:drawing>
+          <wp:inline distT="0" distB="0" distL="0" distR="0" wp14:anchorId="335576BE" wp14:editId="1CC54DC5">
+            <wp:extent cx="5612130" cy="1229360"/>
+            <wp:effectExtent l="0" t="0" r="7620" b="8890"/>
+            <wp:docPr id="2086297283" name="Imagen 1"/>
+            <wp:cNvGraphicFramePr>
+              <a:graphicFrameLocks xmlns:a="http://schemas.openxmlformats.org/drawingml/2006/main" noChangeAspect="1"/>
+            </wp:cNvGraphicFramePr>
+            <a:graphic xmlns:a="http://schemas.openxmlformats.org/drawingml/2006/main">
+              <a:graphicData uri="http://schemas.openxmlformats.org/drawingml/2006/picture">
+                <pic:pic xmlns:pic="http://schemas.openxmlformats.org/drawingml/2006/picture">
+                  <pic:nvPicPr>
+                    <pic:cNvPr id="2086297283" name=""/>
+                    <pic:cNvPicPr/>
+                  </pic:nvPicPr>
+                  <pic:blipFill>
+                    <a:blip r:embed="rId18"/>
+                    <a:stretch>
+                      <a:fillRect/>
+                    </a:stretch>
+                  </pic:blipFill>
+                  <pic:spPr>
+                    <a:xfrm>
+                      <a:off x="0" y="0"/>
+                      <a:ext cx="5612130" cy="1229360"/>
                     </a:xfrm>
                     <a:prstGeom prst="rect">
                       <a:avLst/>

</xml_diff>